<commit_message>
Remove credenciais da documentacao e atualiza secao de responsividade mobile
- DOCUMENTACAO.docx nao reproduz mais valores de credenciais (nem de
  teste/mock) - aponta pra onde encontrar no codigo em vez de listar
  o valor, por politica de seguranca.
- Adiciona secao "Responsividade mobile" documentando os ajustes de
  Login, busca do Header e Toast.
- Atualiza a nota de status do Assistente IA: RAG testado de ponta a
  ponta (perguntas parafraseadas retornam a fonte certa, perguntas
  fora de escopo caem no fallback), e registra a troca do modelo de
  embedding (MiniLM -> mpnet, o menor confundia buscas obvias).

Co-Authored-By: Claude Sonnet 5 <noreply@anthropic.com>
</commit_message>
<xml_diff>
--- a/DOCUMENTACAO.docx
+++ b/DOCUMENTACAO.docx
@@ -93,6 +93,14 @@
       </w:pPr>
       <w:r>
         <w:t>Navegação e performance</w:t>
+      </w:r>
+    </w:p>
+    <w:p>
+      <w:pPr>
+        <w:pStyle w:val="ListBullet"/>
+      </w:pPr>
+      <w:r>
+        <w:t>Responsividade mobile</w:t>
       </w:r>
     </w:p>
     <w:p>
@@ -527,28 +535,12 @@
           <w:color w:val="333333"/>
           <w:sz w:val="26"/>
         </w:rPr>
-        <w:t>Login (credenciais de teste)</w:t>
-      </w:r>
-    </w:p>
-    <w:p>
-      <w:pPr>
-        <w:pStyle w:val="ListBullet"/>
-      </w:pPr>
-      <w:r>
-        <w:t>E-mail: eraldo.junior@proferaldojunior.com.br</w:t>
-      </w:r>
-    </w:p>
-    <w:p>
-      <w:pPr>
-        <w:pStyle w:val="ListBullet"/>
-      </w:pPr>
-      <w:r>
-        <w:t>Senha: IntranetEJ@2026</w:t>
+        <w:t>Login</w:t>
       </w:r>
     </w:p>
     <w:p>
       <w:r>
-        <w:t>A autenticação hoje é mockada no frontend (ver seção "O que é real e o que é mockado") — não há backend de autenticação real ainda.</w:t>
+        <w:t>A autenticação hoje é mockada no frontend (ver seção "O que é real e o que é mockado") — não há backend de autenticação real ainda. A credencial de teste usada para acessar o ambiente de demonstração fica em src/mocks/employees.ts (TEST_CREDENTIAL) e não é reproduzida aqui por questão de segurança.</w:t>
       </w:r>
     </w:p>
     <w:p>
@@ -1231,6 +1223,63 @@
           <w:color w:val="192742"/>
           <w:sz w:val="32"/>
         </w:rPr>
+        <w:t>Responsividade mobile</w:t>
+      </w:r>
+    </w:p>
+    <w:p>
+      <w:r>
+        <w:t>Revisão dedicada pra celular: quando um recurso não cabia na tela pequena, a solução foi adaptar o layout, não simplesmente esconder a funcionalidade ou a animação.</w:t>
+      </w:r>
+    </w:p>
+    <w:p>
+      <w:pPr>
+        <w:pStyle w:val="ListBullet"/>
+      </w:pPr>
+      <w:r>
+        <w:t>Sidebar vira um menu tipo gaveta (slide-in), aberto por um botão de hambúrguer no Header.</w:t>
+      </w:r>
+    </w:p>
+    <w:p>
+      <w:pPr>
+        <w:pStyle w:val="ListBullet"/>
+      </w:pPr>
+      <w:r>
+        <w:t>Login: o painel institucional (logo + palavra rotativa animada) ganhou uma versão condensada pro mobile, em vez de simplesmente sumir — com tamanho de fonte fluido (clamp) pra não estourar a tela em palavras longas como "TRANSPARÊNCIA".</w:t>
+      </w:r>
+    </w:p>
+    <w:p>
+      <w:pPr>
+        <w:pStyle w:val="ListBullet"/>
+      </w:pPr>
+      <w:r>
+        <w:t>Busca do Header: abaixo do breakpoint sm vira um ícone que abre a busca em tela cheia, em vez de desaparecer.</w:t>
+      </w:r>
+    </w:p>
+    <w:p>
+      <w:pPr>
+        <w:pStyle w:val="ListBullet"/>
+      </w:pPr>
+      <w:r>
+        <w:t>Tabelas com scroll horizontal próprio; abas do Calendário do Escritório e do Assistente IA rolam horizontalmente quando não cabem.</w:t>
+      </w:r>
+    </w:p>
+    <w:p>
+      <w:pPr>
+        <w:pStyle w:val="ListBullet"/>
+      </w:pPr>
+      <w:r>
+        <w:t>Toast (notificação de canto) com limite de largura pra não estourar em telas bem estreitas.</w:t>
+      </w:r>
+    </w:p>
+    <w:p>
+      <w:pPr>
+        <w:pStyle w:val="Heading2"/>
+      </w:pPr>
+      <w:r>
+        <w:rPr>
+          <w:color w:val="192742"/>
+          <w:sz w:val="32"/>
+        </w:rPr>
         <w:t>Backend Python — Meu Authenticator e Assistente IA</w:t>
       </w:r>
     </w:p>
@@ -1278,7 +1327,7 @@
         <w:pStyle w:val="ListBullet"/>
       </w:pPr>
       <w:r>
-        <w:t>Embeddings: Sentence Transformers (modelo multilíngue, roda em CPU)</w:t>
+        <w:t>Embeddings: Sentence Transformers (paraphrase-multilingual-mpnet-base-v2, multilíngue, roda em CPU)</w:t>
       </w:r>
     </w:p>
     <w:p>
@@ -1315,7 +1364,7 @@
     </w:p>
     <w:p>
       <w:r>
-        <w:t>Nota de status: o código deste módulo foi todo escrito nesta sessão (backend/assistant/, backend/knowledge_base/), mas a instalação das dependências (chromadb, sentence-transformers) e a indexação inicial ainda estavam em andamento no momento desta atualização — ver backend/README.md, seção "Assistente IA", para o passo a passo de instalação e teste.</w:t>
+        <w:t>Testado de ponta a ponta: a indexação dos 15 documentos rodou com sucesso e perguntas parafraseadas (não o texto exato dos documentos, ex.: "posso tirar férias quando?") retornam o trecho certo com a fonte correta; perguntas fora de escopo (ex.: "qual a capital da França?") corretamente caem na mensagem de "não encontrei". No caminho, trocamos o modelo de embedding inicial (MiniLM, menor) por este maior — o menor confundia buscas óbvias, como "sistemas usados" retornando o documento de horário de expediente.</w:t>
       </w:r>
     </w:p>
     <w:p>

</xml_diff>

<commit_message>
Remove o build publicado (intranet/) do controle de versao
- O repositorio agora guarda so codigo-fonte: intranet-app/dist (e o
  antigo intranet/, copia manual dele) nunca deveriam ter sido
  versionados - cada build gerava dezenas de arquivos de hash
  renomeados, poluindo todo commit.
- Adiciona /intranet/ ao .gitignore. Os arquivos continuam no disco
  localmente (nao foram apagados), so pararam de ser rastreados.
- Atualiza DOCUMENTACAO.docx: remove o passo manual de copiar
  dist/* para intranet/ e commitar as duas pastas: publicar agora e
  so "npm run build" quando quiser testar ou implantar em algum
  lugar. Registra GitHub Pages + Actions como caminho recomendado
  para quando a hospedagem for decidida (o site ainda nao esta no ar
  em lugar nenhum).

Co-Authored-By: Claude Sonnet 5 <noreply@anthropic.com>
</commit_message>
<xml_diff>
--- a/DOCUMENTACAO.docx
+++ b/DOCUMENTACAO.docx
@@ -195,8 +195,6 @@
         <w:br/>
         <w:t>├── index.html, assets/          → site institucional (estático)</w:t>
         <w:br/>
-        <w:t>├── intranet/                    → build publicado da intranet</w:t>
-        <w:br/>
         <w:t>├── intranet-app/                → código-fonte da intranet (React)</w:t>
         <w:br/>
         <w:t>└── backend/                     → API Python (Authenticator + Assistente IA)</w:t>
@@ -313,39 +311,7 @@
           </w:tcPr>
           <w:p>
             <w:r>
-              <w:t>Aplicação React + TypeScript, é o app "de verdade" que se edita.</w:t>
-            </w:r>
-          </w:p>
-        </w:tc>
-      </w:tr>
-      <w:tr>
-        <w:tc>
-          <w:tcPr>
-            <w:tcW w:type="dxa" w:w="2880"/>
-          </w:tcPr>
-          <w:p>
-            <w:r>
-              <w:t>Intranet (build publicado)</w:t>
-            </w:r>
-          </w:p>
-        </w:tc>
-        <w:tc>
-          <w:tcPr>
-            <w:tcW w:type="dxa" w:w="2880"/>
-          </w:tcPr>
-          <w:p>
-            <w:r>
-              <w:t>intranet/</w:t>
-            </w:r>
-          </w:p>
-        </w:tc>
-        <w:tc>
-          <w:tcPr>
-            <w:tcW w:type="dxa" w:w="2880"/>
-          </w:tcPr>
-          <w:p>
-            <w:r>
-              <w:t>Saída compilada do intranet-app/, é o que fica servido em produção.</w:t>
+              <w:t>Aplicação React + TypeScript — único lugar onde o código da intranet é editado.</w:t>
             </w:r>
           </w:p>
         </w:tc>
@@ -384,6 +350,11 @@
       </w:tr>
     </w:tbl>
     <w:p/>
+    <w:p>
+      <w:r>
+        <w:t>Não existe mais uma pasta intranet/ versionada no git com o build compilado — gerar e publicar esse build é sempre um passo separado, feito sob demanda (ver "Publicação / build" abaixo). Isso mantém o repositório só com código-fonte, sem os arquivos gerados a cada build poluindo o histórico de commits.</w:t>
+      </w:r>
+    </w:p>
     <w:p>
       <w:pPr>
         <w:pStyle w:val="Heading2"/>
@@ -510,20 +481,6 @@
         <w:t>cd dist &amp;&amp; python3 -m http.server 8091</w:t>
         <w:br/>
         <w:t># abrir http://localhost:8091/</w:t>
-      </w:r>
-    </w:p>
-    <w:p>
-      <w:r>
-        <w:t>O intranet/ na raiz do repo é uma cópia manual de intranet-app/dist/ — depois de um build, é preciso copiar o conteúdo pra lá pra publicar:</w:t>
-      </w:r>
-    </w:p>
-    <w:p>
-      <w:r>
-        <w:rPr>
-          <w:rFonts w:ascii="Consolas" w:hAnsi="Consolas"/>
-          <w:sz w:val="19"/>
-        </w:rPr>
-        <w:t>cp -r intranet-app/dist/. intranet/</w:t>
       </w:r>
     </w:p>
     <w:p>
@@ -1421,44 +1378,12 @@
     </w:p>
     <w:p>
       <w:r>
-        <w:t>Fluxo atual (manual, sem CI/CD):</w:t>
-      </w:r>
-    </w:p>
-    <w:p>
-      <w:pPr>
-        <w:pStyle w:val="ListNumber"/>
-      </w:pPr>
-      <w:r>
-        <w:t>Editar código em intranet-app/src/</w:t>
-      </w:r>
-    </w:p>
-    <w:p>
-      <w:pPr>
-        <w:pStyle w:val="ListNumber"/>
-      </w:pPr>
-      <w:r>
-        <w:t>npm run build dentro de intranet-app/</w:t>
-      </w:r>
-    </w:p>
-    <w:p>
-      <w:pPr>
-        <w:pStyle w:val="ListNumber"/>
-      </w:pPr>
-      <w:r>
-        <w:t>Copiar intranet-app/dist/* para intranet/</w:t>
-      </w:r>
-    </w:p>
-    <w:p>
-      <w:pPr>
-        <w:pStyle w:val="ListNumber"/>
-      </w:pPr>
-      <w:r>
-        <w:t>Commitar as duas pastas (código-fonte + build publicado)</w:t>
+        <w:t>O repositório só guarda código-fonte — o build (intranet-app/dist/) nunca é commitado, é sempre gerado sob demanda com npm run build (ver "Como rodar localmente"). Ainda não há hospedagem definida nem pipeline de deploy automatizado configurado; quando isso for decidido, o caminho mais direto pra um app estático como este é GitHub Pages com um workflow de GitHub Actions que builda e publica automaticamente a cada push.</w:t>
       </w:r>
     </w:p>
     <w:p>
       <w:r>
-        <w:t>O intranet-app/.gitignore já ignora node_modules/, dist/ e .env. O .gitignore da raiz do repo ignora venv/, __pycache__/, backend/chroma_data/ e qualquer .env do backend também.</w:t>
+        <w:t>O intranet-app/.gitignore já ignora node_modules/, dist/ e .env. O .gitignore da raiz do repo ignora venv/, __pycache__/, backend/chroma_data/, a própria pasta intranet/ (build local, não versionado) e qualquer .env do backend também.</w:t>
       </w:r>
     </w:p>
     <w:p>

</xml_diff>